<commit_message>
Moved Caleb's tables over to Team Editor folder and updated some of Kim's headers to be consistent with the other tables.
</commit_message>
<xml_diff>
--- a/03_Team_Work/Team4/Milestone_4_Interfaces_and_Data_Structures/TeamEditor/KU_M4_Team4_1.5.1_API_Register_User_Response_v01.docx
+++ b/03_Team_Work/Team4/Milestone_4_Interfaces_and_Data_Structures/TeamEditor/KU_M4_Team4_1.5.1_API_Register_User_Response_v01.docx
@@ -30,8 +30,19 @@
           <w:sz w:val="27"/>
           <w:szCs w:val="27"/>
         </w:rPr>
-        <w:t xml:space="preserve"> API </w:t>
+        <w:t>-</w:t>
       </w:r>
+      <w:r>
+        <w:rPr>
+          <w:rFonts w:ascii="Arial" w:hAnsi="Arial" w:cs="Arial"/>
+          <w:b/>
+          <w:bCs/>
+          <w:sz w:val="27"/>
+          <w:szCs w:val="27"/>
+        </w:rPr>
+        <w:t xml:space="preserve">API </w:t>
+      </w:r>
+      <w:proofErr w:type="spellStart"/>
       <w:r>
         <w:rPr>
           <w:rFonts w:ascii="Arial" w:hAnsi="Arial" w:cs="Arial"/>
@@ -52,6 +63,7 @@
         </w:rPr>
         <w:t>egisterUserResponse</w:t>
       </w:r>
+      <w:proofErr w:type="spellEnd"/>
     </w:p>
     <w:tbl>
       <w:tblPr>
@@ -372,6 +384,7 @@
                 <w:szCs w:val="22"/>
               </w:rPr>
             </w:pPr>
+            <w:proofErr w:type="spellStart"/>
             <w:r>
               <w:rPr>
                 <w:rFonts w:ascii="Arial" w:hAnsi="Arial" w:cs="Arial"/>
@@ -380,6 +393,7 @@
               </w:rPr>
               <w:t>userId</w:t>
             </w:r>
+            <w:proofErr w:type="spellEnd"/>
           </w:p>
         </w:tc>
         <w:tc>
@@ -543,7 +557,25 @@
                 <w:sz w:val="22"/>
                 <w:szCs w:val="22"/>
               </w:rPr>
-              <w:t>Type of account created, student or company representative.</w:t>
+              <w:t xml:space="preserve">Type of account </w:t>
+            </w:r>
+            <w:proofErr w:type="gramStart"/>
+            <w:r>
+              <w:rPr>
+                <w:rFonts w:ascii="Arial" w:hAnsi="Arial" w:cs="Arial"/>
+                <w:sz w:val="22"/>
+                <w:szCs w:val="22"/>
+              </w:rPr>
+              <w:t>created,</w:t>
+            </w:r>
+            <w:proofErr w:type="gramEnd"/>
+            <w:r>
+              <w:rPr>
+                <w:rFonts w:ascii="Arial" w:hAnsi="Arial" w:cs="Arial"/>
+                <w:sz w:val="22"/>
+                <w:szCs w:val="22"/>
+              </w:rPr>
+              <w:t xml:space="preserve"> student or company representative.</w:t>
             </w:r>
           </w:p>
         </w:tc>
@@ -567,6 +599,7 @@
                 <w:szCs w:val="22"/>
               </w:rPr>
             </w:pPr>
+            <w:proofErr w:type="spellStart"/>
             <w:r>
               <w:rPr>
                 <w:rFonts w:ascii="Arial" w:hAnsi="Arial" w:cs="Arial"/>
@@ -575,6 +608,7 @@
               </w:rPr>
               <w:t>createdAt</w:t>
             </w:r>
+            <w:proofErr w:type="spellEnd"/>
           </w:p>
         </w:tc>
         <w:tc>
@@ -590,6 +624,7 @@
                 <w:szCs w:val="22"/>
               </w:rPr>
             </w:pPr>
+            <w:proofErr w:type="spellStart"/>
             <w:r>
               <w:rPr>
                 <w:rFonts w:ascii="Arial" w:hAnsi="Arial" w:cs="Arial"/>
@@ -598,6 +633,7 @@
               </w:rPr>
               <w:t>DateTime</w:t>
             </w:r>
+            <w:proofErr w:type="spellEnd"/>
           </w:p>
         </w:tc>
         <w:tc>

</xml_diff>